<commit_message>
Remove fees from the proposal so sign-off covers the work only.
</commit_message>
<xml_diff>
--- a/docs/SoftBuilds Proposal for Travel With Moeen.docx
+++ b/docs/SoftBuilds Proposal for Travel With Moeen.docx
@@ -4,11 +4,14 @@
   <w:body>
     <w:p>
       <w:pPr>
-        <w:spacing w:before="0" w:after="0" w:line="240" w:lineRule="auto"/>
-      </w:pPr>
-      <w:r>
+        <w:spacing w:after="0" w:line="240" w:lineRule="auto"/>
+      </w:pPr>
+      <w:r>
+        <w:rPr>
+          <w:noProof/>
+        </w:rPr>
         <w:drawing>
-          <wp:anchor distT="0" distB="0" distL="0" distR="0" simplePos="0" relativeHeight="251659264" behindDoc="0" locked="0" layoutInCell="1" allowOverlap="1">
+          <wp:anchor distT="0" distB="0" distL="0" distR="0" simplePos="0" relativeHeight="251659264" behindDoc="0" locked="0" layoutInCell="1" allowOverlap="1" wp14:anchorId="573C552B" wp14:editId="409C3E71">
             <wp:simplePos x="0" y="0"/>
             <wp:positionH relativeFrom="page">
               <wp:posOffset>0</wp:posOffset>
@@ -20,18 +23,18 @@
             <wp:effectExtent l="0" t="0" r="0" b="0"/>
             <wp:wrapNone/>
             <wp:docPr id="1" name="Picture 1"/>
-            <wp:cNvGraphicFramePr xmlns:a="http://schemas.openxmlformats.org/drawingml/2006/main">
-              <a:graphicFrameLocks noChangeAspect="1"/>
+            <wp:cNvGraphicFramePr>
+              <a:graphicFrameLocks xmlns:a="http://schemas.openxmlformats.org/drawingml/2006/main" noChangeAspect="1"/>
             </wp:cNvGraphicFramePr>
-            <a:graphic xmlns:a="http://schemas.openxmlformats.org/drawingml/2006/main" xmlns:pic="http://schemas.openxmlformats.org/drawingml/2006/picture">
+            <a:graphic xmlns:a="http://schemas.openxmlformats.org/drawingml/2006/main">
               <a:graphicData uri="http://schemas.openxmlformats.org/drawingml/2006/picture">
-                <pic:pic>
+                <pic:pic xmlns:pic="http://schemas.openxmlformats.org/drawingml/2006/picture">
                   <pic:nvPicPr>
                     <pic:cNvPr id="0" name="_cover_page.png"/>
                     <pic:cNvPicPr/>
                   </pic:nvPicPr>
                   <pic:blipFill>
-                    <a:blip r:embed="rId20"/>
+                    <a:blip r:embed="rId8"/>
                     <a:stretch>
                       <a:fillRect/>
                     </a:stretch>
@@ -41,7 +44,9 @@
                       <a:off x="0" y="0"/>
                       <a:ext cx="7560310" cy="10692130"/>
                     </a:xfrm>
-                    <a:prstGeom prst="rect"/>
+                    <a:prstGeom prst="rect">
+                      <a:avLst/>
+                    </a:prstGeom>
                   </pic:spPr>
                 </pic:pic>
               </a:graphicData>
@@ -284,7 +289,7 @@
         <w:spacing w:before="40" w:after="160"/>
       </w:pPr>
       <w:r>
-        <w:t>Please read this document and sign Section 24 if you agree. After you sign, this document is the plan we will follow. If you want a change later, please send it in writing.</w:t>
+        <w:t>Please read this document and sign Section 23 if you agree. After you sign, this document is the plan we will follow. If you want a change later, please send it in writing.</w:t>
       </w:r>
     </w:p>
     <w:p>
@@ -292,7 +297,7 @@
         <w:spacing w:before="40" w:after="160"/>
       </w:pPr>
       <w:r>
-        <w:t>The fee and the payment plan are not in this document. They will be set out in a separate document, called Schedule A. When you sign, you agree the work, the way we will do it, and the eight-week plan in Section 13. You are not agreeing to a fee.</w:t>
+        <w:t>When you sign, you agree the work, the way we will do it, and the eight-week plan in Section 13.</w:t>
       </w:r>
     </w:p>
     <w:p>
@@ -1756,6 +1761,7 @@
           <w:b/>
           <w:color w:val="1798B0"/>
         </w:rPr>
+        <w:lastRenderedPageBreak/>
         <w:t xml:space="preserve">•  </w:t>
       </w:r>
       <w:r>
@@ -1935,22 +1941,6 @@
       </w:r>
       <w:r>
         <w:t>Deleting your Excel file. The file stays with you. We copy the prices from it.</w:t>
-      </w:r>
-    </w:p>
-    <w:p>
-      <w:pPr>
-        <w:spacing w:before="20" w:after="60" w:line="264" w:lineRule="auto"/>
-        <w:ind w:left="425" w:hanging="198"/>
-      </w:pPr>
-      <w:r>
-        <w:rPr>
-          <w:b/>
-          <w:color w:val="1798B0"/>
-        </w:rPr>
-        <w:t xml:space="preserve">•  </w:t>
-      </w:r>
-      <w:r>
-        <w:t>The fee and hosting bills. Those will be Schedule A. The eight weeks in Section 13 are part of this document.</w:t>
       </w:r>
     </w:p>
     <w:p>
@@ -2652,6 +2642,7 @@
               <w:rPr>
                 <w:sz w:val="20"/>
               </w:rPr>
+              <w:lastRenderedPageBreak/>
               <w:t>L-10</w:t>
             </w:r>
           </w:p>
@@ -4231,6 +4222,7 @@
           <w:color w:val="0F4C68"/>
           <w:sz w:val="26"/>
         </w:rPr>
+        <w:lastRenderedPageBreak/>
         <w:t>9.1 The steps</w:t>
       </w:r>
     </w:p>
@@ -4828,6 +4820,7 @@
               <w:rPr>
                 <w:sz w:val="20"/>
               </w:rPr>
+              <w:lastRenderedPageBreak/>
               <w:t>Kalash Valley and Chitral</w:t>
             </w:r>
           </w:p>
@@ -5624,6 +5617,7 @@
           <w:rFonts w:ascii="Space Grotesk" w:eastAsia="Space Grotesk" w:hAnsi="Space Grotesk"/>
           <w:sz w:val="36"/>
         </w:rPr>
+        <w:lastRenderedPageBreak/>
         <w:t>12. Steps, what you receive, and how we check it</w:t>
       </w:r>
     </w:p>
@@ -6141,6 +6135,7 @@
           <w:b/>
           <w:color w:val="1798B0"/>
         </w:rPr>
+        <w:lastRenderedPageBreak/>
         <w:t xml:space="preserve">•  </w:t>
       </w:r>
       <w:r>
@@ -6391,7 +6386,7 @@
         <w:spacing w:before="40" w:after="160"/>
       </w:pPr>
       <w:r>
-        <w:t>The weeks start on the day you sign Section 24. The plan is for one full-time developer. It also allows you up to five working days to review each step.</w:t>
+        <w:t>The weeks start on the day you sign Section 23. The plan is for one full-time developer. It also allows you up to five working days to review each step.</w:t>
       </w:r>
     </w:p>
     <w:p>
@@ -7073,6 +7068,7 @@
         <w:spacing w:before="40" w:after="160"/>
       </w:pPr>
       <w:r>
+        <w:lastRenderedPageBreak/>
         <w:t>Inside these eight weeks, 25 working days are for building. The other 15 working days are for your review. They are not extra build days.</w:t>
       </w:r>
     </w:p>
@@ -7357,6 +7353,7 @@
           <w:rFonts w:ascii="Space Grotesk" w:eastAsia="Space Grotesk" w:hAnsi="Space Grotesk"/>
           <w:sz w:val="36"/>
         </w:rPr>
+        <w:lastRenderedPageBreak/>
         <w:t>16. Support after acceptance</w:t>
       </w:r>
     </w:p>
@@ -7405,7 +7402,7 @@
         <w:spacing w:before="40" w:after="160"/>
       </w:pPr>
       <w:r>
-        <w:t>The office system built under this document is yours once the fees in Schedule A are paid. Until those fees are paid, SoftBuilds Pvt Ltd may pause further work. Your existing website will stay online and will stay yours.</w:t>
+        <w:t>The office system built under this document is yours. Your existing website will stay online and will stay yours.</w:t>
       </w:r>
     </w:p>
     <w:p>
@@ -7613,6 +7610,7 @@
           <w:rFonts w:ascii="Space Grotesk" w:eastAsia="Space Grotesk" w:hAnsi="Space Grotesk"/>
           <w:sz w:val="36"/>
         </w:rPr>
+        <w:lastRenderedPageBreak/>
         <w:t>20. What we still need from you</w:t>
       </w:r>
     </w:p>
@@ -8557,130 +8555,11 @@
           <w:rFonts w:ascii="Space Grotesk" w:eastAsia="Space Grotesk" w:hAnsi="Space Grotesk"/>
           <w:b/>
         </w:rPr>
+        <w:lastRenderedPageBreak/>
         <w:t xml:space="preserve">5.  </w:t>
       </w:r>
       <w:r>
         <w:t>Keep your Excel file if you still want a spreadsheet copy. We will not delete it.</w:t>
-      </w:r>
-    </w:p>
-    <w:p>
-      <w:pPr>
-        <w:spacing w:before="20" w:after="60" w:line="264" w:lineRule="auto"/>
-        <w:ind w:left="482" w:hanging="255"/>
-      </w:pPr>
-      <w:r>
-        <w:rPr>
-          <w:rFonts w:ascii="Space Grotesk" w:eastAsia="Space Grotesk" w:hAnsi="Space Grotesk"/>
-          <w:b/>
-        </w:rPr>
-        <w:t xml:space="preserve">6.  </w:t>
-      </w:r>
-      <w:r>
-        <w:t>Pay the fees in Schedule A on the dates that document will set. This document does not set those dates.</w:t>
-      </w:r>
-    </w:p>
-    <w:p>
-      <w:pPr>
-        <w:keepNext/>
-        <w:pBdr>
-          <w:bottom w:val="single" w:sz="10" w:space="1" w:color="1798B0"/>
-        </w:pBdr>
-        <w:spacing w:before="320" w:after="120" w:line="252" w:lineRule="auto"/>
-      </w:pPr>
-      <w:r>
-        <w:rPr>
-          <w:rFonts w:ascii="Space Grotesk" w:eastAsia="Space Grotesk" w:hAnsi="Space Grotesk"/>
-          <w:sz w:val="36"/>
-        </w:rPr>
-        <w:t>23. Fee</w:t>
-      </w:r>
-    </w:p>
-    <w:p>
-      <w:pPr>
-        <w:spacing w:before="40" w:after="160"/>
-      </w:pPr>
-      <w:r>
-        <w:t>The fee, the payment dates, and what happens if the schedule moves because a review is late or a change is added, will be written in Schedule A.</w:t>
-      </w:r>
-    </w:p>
-    <w:p>
-      <w:pPr>
-        <w:spacing w:before="40" w:after="160"/>
-      </w:pPr>
-      <w:r>
-        <w:t>Schedule A is not part of version 1.0. Signing Section 24 does not agree a fee.</w:t>
-      </w:r>
-    </w:p>
-    <w:p>
-      <w:pPr>
-        <w:spacing w:before="40" w:after="160"/>
-      </w:pPr>
-      <w:r>
-        <w:t>Schedule A will state:</w:t>
-      </w:r>
-    </w:p>
-    <w:p>
-      <w:pPr>
-        <w:spacing w:before="20" w:after="60" w:line="264" w:lineRule="auto"/>
-        <w:ind w:left="425" w:hanging="198"/>
-      </w:pPr>
-      <w:r>
-        <w:rPr>
-          <w:b/>
-          <w:color w:val="1798B0"/>
-        </w:rPr>
-        <w:t xml:space="preserve">•  </w:t>
-      </w:r>
-      <w:r>
-        <w:t>The fee for Steps 1 to 3</w:t>
-      </w:r>
-    </w:p>
-    <w:p>
-      <w:pPr>
-        <w:spacing w:before="20" w:after="60" w:line="264" w:lineRule="auto"/>
-        <w:ind w:left="425" w:hanging="198"/>
-      </w:pPr>
-      <w:r>
-        <w:rPr>
-          <w:b/>
-          <w:color w:val="1798B0"/>
-        </w:rPr>
-        <w:t xml:space="preserve">•  </w:t>
-      </w:r>
-      <w:r>
-        <w:t>When each part of the fee is due</w:t>
-      </w:r>
-    </w:p>
-    <w:p>
-      <w:pPr>
-        <w:spacing w:before="20" w:after="60" w:line="264" w:lineRule="auto"/>
-        <w:ind w:left="425" w:hanging="198"/>
-      </w:pPr>
-      <w:r>
-        <w:rPr>
-          <w:b/>
-          <w:color w:val="1798B0"/>
-        </w:rPr>
-        <w:t xml:space="preserve">•  </w:t>
-      </w:r>
-      <w:r>
-        <w:t>The fee for the four weeks of support in Section 16, if it is not already inside the Steps 1 to 3 fee</w:t>
-      </w:r>
-    </w:p>
-    <w:p>
-      <w:pPr>
-        <w:spacing w:before="20" w:after="60" w:line="264" w:lineRule="auto"/>
-        <w:ind w:left="425" w:hanging="198"/>
-      </w:pPr>
-      <w:r>
-        <w:rPr>
-          <w:b/>
-          <w:color w:val="1798B0"/>
-        </w:rPr>
-        <w:t xml:space="preserve">•  </w:t>
-      </w:r>
-      <w:r>
-        <w:t>That Step 4 is priced only after you give written approval</w:t>
       </w:r>
     </w:p>
     <w:p>
@@ -8697,7 +8576,8 @@
           <w:rFonts w:ascii="Space Grotesk" w:eastAsia="Space Grotesk" w:hAnsi="Space Grotesk"/>
           <w:sz w:val="36"/>
         </w:rPr>
-        <w:t>24. Sign-off</w:t>
+        <w:lastRenderedPageBreak/>
+        <w:t>23. Sign-off</w:t>
       </w:r>
     </w:p>
     <w:p>
@@ -8713,7 +8593,7 @@
         <w:spacing w:before="40" w:after="160"/>
       </w:pPr>
       <w:r>
-        <w:t>Section 6.2 and Step 4 are not part of that first delivery. Section 23 does not agree a fee.</w:t>
+        <w:t>Section 6.2 and Step 4 are not part of that first delivery.</w:t>
       </w:r>
     </w:p>
     <w:tbl>
@@ -9092,12 +8972,12 @@
       </w:r>
     </w:p>
     <w:sectPr>
-      <w:headerReference w:type="even" r:id="rId10"/>
-      <w:headerReference w:type="default" r:id="rId11"/>
-      <w:footerReference w:type="even" r:id="rId12"/>
-      <w:footerReference w:type="default" r:id="rId13"/>
-      <w:headerReference w:type="first" r:id="rId14"/>
-      <w:footerReference w:type="first" r:id="rId15"/>
+      <w:headerReference w:type="even" r:id="rId9"/>
+      <w:headerReference w:type="default" r:id="rId10"/>
+      <w:footerReference w:type="even" r:id="rId11"/>
+      <w:footerReference w:type="default" r:id="rId12"/>
+      <w:headerReference w:type="first" r:id="rId13"/>
+      <w:footerReference w:type="first" r:id="rId14"/>
       <w:pgSz w:w="11906" w:h="16838"/>
       <w:pgMar w:top="1440" w:right="1080" w:bottom="1440" w:left="1080" w:header="720" w:footer="720" w:gutter="0"/>
       <w:cols w:space="720"/>

</xml_diff>